<commit_message>
Revise messaging and statistics in UPstander International report for clarity and impact
</commit_message>
<xml_diff>
--- a/microfrontend/washington_smiles/artifacts/p3b_First_Video_Script_WashingtonSmiles.docx
+++ b/microfrontend/washington_smiles/artifacts/p3b_First_Video_Script_WashingtonSmiles.docx
@@ -220,7 +220,7 @@
           <w:i w:val="0"/>
           <w:sz w:val="20"/>
         </w:rPr>
-        <w:t>Here's the honest boundary of what I can see from outside: your location count, how long you've operated, and what you've written about your own playbook. What I can't see is how many hours each manager spends on scheduling and collections weekly, your real collections rate, or how long a new manager takes to become fully productive. Those numbers are exactly where the real cost is sitting — and they're the first thing worth mapping out together.</w:t>
+        <w:t>Here's the honest boundary of what I can see from outside: your location count, how long you've operated, and what you've written about your own playbook. What I can't see is how many hours each manager spends on scheduling and collections weekly, your actual no-show and cancellation rate, or how quickly a drifting location actually gets noticed. Those numbers are exactly where the real cost is sitting — and they're the first thing worth mapping out together.</w:t>
       </w:r>
     </w:p>
     <w:p>
@@ -737,7 +737,7 @@
           <w:i w:val="0"/>
           <w:sz w:val="24"/>
         </w:rPr>
-        <w:t>"Here's the honest boundary of what I can see from outside: your location count, how long you've operated, and what you've written about your own playbook. What I can't see is how many hours each manager spends on scheduling and collections weekly, your real collections rate, or how long a new manager takes to become fully productive. Those numbers are exactly where the real cost is sitting — and they're the first thing worth mapping out together."</w:t>
+        <w:t>"Here's the honest boundary of what I can see from outside: your location count, how long you've operated, and what you've written about your own playbook. What I can't see is how many hours each manager spends on scheduling and collections weekly, your actual no-show and cancellation rate, or how quickly a drifting location actually gets noticed. Those numbers are exactly where the real cost is sitting — and they're the first thing worth mapping out together."</w:t>
       </w:r>
     </w:p>
     <w:p>

</xml_diff>